<commit_message>
Final 5-page summary report with project structure section
</commit_message>
<xml_diff>
--- a/Sporza_Scraper_Summary_Report.docx
+++ b/Sporza_Scraper_Summary_Report.docx
@@ -301,7 +301,190 @@
         <w:pStyle w:val="Heading1"/>
       </w:pPr>
       <w:r>
-        <w:t>5. Command Reference</w:t>
+        <w:t>5. Project Structure</w:t>
+      </w:r>
+    </w:p>
+    <w:p>
+      <w:r>
+        <w:t>The sporza_scraper/ package contains the following modules:</w:t>
+      </w:r>
+    </w:p>
+    <w:p>
+      <w:r>
+        <w:rPr>
+          <w:b/>
+        </w:rPr>
+        <w:t xml:space="preserve">__main__.py: </w:t>
+      </w:r>
+      <w:r>
+        <w:t>CLI entry point with argparse handling all subcommands (news, pl-scrape, results, live, stats, predict, sentiment).</w:t>
+      </w:r>
+    </w:p>
+    <w:p>
+      <w:r>
+        <w:rPr>
+          <w:b/>
+        </w:rPr>
+        <w:t xml:space="preserve">config.py: </w:t>
+      </w:r>
+      <w:r>
+        <w:t>All URLs, timeouts, retry settings, user-agent string, team name aliases, and directory paths.</w:t>
+      </w:r>
+    </w:p>
+    <w:p>
+      <w:r>
+        <w:rPr>
+          <w:b/>
+        </w:rPr>
+        <w:t xml:space="preserve">models.py: </w:t>
+      </w:r>
+      <w:r>
+        <w:t>Dataclasses for NewsArticle, FootballMatch, PlayerMention, PerformanceSignal, and MatchPrediction.</w:t>
+      </w:r>
+    </w:p>
+    <w:p>
+      <w:r>
+        <w:rPr>
+          <w:b/>
+        </w:rPr>
+        <w:t xml:space="preserve">http_client.py: </w:t>
+      </w:r>
+      <w:r>
+        <w:t>ThrottledClient wrapping httpx with 1.5s minimum delay, exponential backoff, and configurable timeouts.</w:t>
+      </w:r>
+    </w:p>
+    <w:p>
+      <w:r>
+        <w:rPr>
+          <w:b/>
+        </w:rPr>
+        <w:t xml:space="preserve">robots.py: </w:t>
+      </w:r>
+      <w:r>
+        <w:t>RobotsPolicy class that fetches and caches sporza.be/robots.txt, enforcing crawl permissions.</w:t>
+      </w:r>
+    </w:p>
+    <w:p>
+      <w:r>
+        <w:rPr>
+          <w:b/>
+        </w:rPr>
+        <w:t xml:space="preserve">parsers/ (news.py, football_results.py, __init__.py): </w:t>
+      </w:r>
+      <w:r>
+        <w:t>HTML parsers using BeautifulSoup/lxml for news articles, football results, and live matches.</w:t>
+      </w:r>
+    </w:p>
+    <w:p>
+      <w:r>
+        <w:rPr>
+          <w:b/>
+        </w:rPr>
+        <w:t xml:space="preserve">pipeline.py: </w:t>
+      </w:r>
+      <w:r>
+        <w:t>Orchestrator connecting HTTP client, robots policy, parsers, enrichment, and storage into scrape workflows.</w:t>
+      </w:r>
+    </w:p>
+    <w:p>
+      <w:r>
+        <w:rPr>
+          <w:b/>
+        </w:rPr>
+        <w:t xml:space="preserve">player_extractor.py: </w:t>
+      </w:r>
+      <w:r>
+        <w:t>Dual spaCy NER + dictionary player detection with cached regex patterns.</w:t>
+      </w:r>
+    </w:p>
+    <w:p>
+      <w:r>
+        <w:rPr>
+          <w:b/>
+        </w:rPr>
+        <w:t xml:space="preserve">signals.py: </w:t>
+      </w:r>
+      <w:r>
+        <w:t>11-type performance signal detector with proximity scoring and negation awareness.</w:t>
+      </w:r>
+    </w:p>
+    <w:p>
+      <w:r>
+        <w:rPr>
+          <w:b/>
+        </w:rPr>
+        <w:t xml:space="preserve">sentiment.py: </w:t>
+      </w:r>
+      <w:r>
+        <w:t>Dutch lexicon-based sentiment analyser (350 words) with intensifier support.</w:t>
+      </w:r>
+    </w:p>
+    <w:p>
+      <w:r>
+        <w:rPr>
+          <w:b/>
+        </w:rPr>
+        <w:t xml:space="preserve">storage.py: </w:t>
+      </w:r>
+      <w:r>
+        <w:t>Dual JSON + SQLite persistence with WAL mode, batch inserts, and context manager.</w:t>
+      </w:r>
+    </w:p>
+    <w:p>
+      <w:r>
+        <w:rPr>
+          <w:b/>
+        </w:rPr>
+        <w:t xml:space="preserve">match_stats.py: </w:t>
+      </w:r>
+      <w:r>
+        <w:t>MatchDatabase loading football-data.co.uk CSVs with indexed team lookups for attack/defence ratings.</w:t>
+      </w:r>
+    </w:p>
+    <w:p>
+      <w:r>
+        <w:rPr>
+          <w:b/>
+        </w:rPr>
+        <w:t xml:space="preserve">predictor.py: </w:t>
+      </w:r>
+      <w:r>
+        <w:t>Hybrid Poisson prediction engine combining statistical baselines with Sporza sentiment modifiers.</w:t>
+      </w:r>
+    </w:p>
+    <w:p>
+      <w:r>
+        <w:rPr>
+          <w:b/>
+        </w:rPr>
+        <w:t xml:space="preserve">dashboard.py: </w:t>
+      </w:r>
+      <w:r>
+        <w:t>Streamlit web app with team momentum chart, player rankings, and interactive match predictor.</w:t>
+      </w:r>
+    </w:p>
+    <w:p>
+      <w:r>
+        <w:rPr>
+          <w:b/>
+        </w:rPr>
+        <w:t xml:space="preserve">utils.py: </w:t>
+      </w:r>
+      <w:r>
+        <w:t>Helper functions: slugify(), normalise_url(), parse_iso_datetime(), and Dutch month name parsing.</w:t>
+      </w:r>
+    </w:p>
+    <w:p>
+      <w:r>
+        <w:t>Supporting files at project root: Dockerfile (multi-stage build), docker-compose.yml (scraper + dashboard services), .dockerignore, requirements.txt, and tests/ directory with pytest test suite.</w:t>
+      </w:r>
+    </w:p>
+    <w:p>
+      <w:pPr>
+        <w:pStyle w:val="Heading1"/>
+      </w:pPr>
+      <w:r>
+        <w:t>6. Command Reference</w:t>
       </w:r>
     </w:p>
     <w:p>
@@ -312,7 +495,7 @@
         <w:t xml:space="preserve">News scrape: </w:t>
       </w:r>
       <w:r>
-        <w:t>python -m sporza_scraper news --limit 20 — Scrapes general news articles from sporza.be.</w:t>
+        <w:t>python -m sporza_scraper news --limit 20</w:t>
       </w:r>
     </w:p>
     <w:p>
@@ -323,7 +506,7 @@
         <w:t xml:space="preserve">PL scrape: </w:t>
       </w:r>
       <w:r>
-        <w:t>python -m sporza_scraper pl-scrape --limit 50 — Scrapes Premier League articles with full NLP enrichment.</w:t>
+        <w:t>python -m sporza_scraper pl-scrape --limit 50</w:t>
       </w:r>
     </w:p>
     <w:p>
@@ -334,7 +517,7 @@
         <w:t xml:space="preserve">Stats download: </w:t>
       </w:r>
       <w:r>
-        <w:t>python -m sporza_scraper stats --download — Downloads the match statistics CSV from football-data.co.uk.</w:t>
+        <w:t>python -m sporza_scraper stats --download</w:t>
       </w:r>
     </w:p>
     <w:p>
@@ -345,7 +528,7 @@
         <w:t xml:space="preserve">Match prediction: </w:t>
       </w:r>
       <w:r>
-        <w:t>python -m sporza_scraper predict --match Arsenal “Manchester City” — Generates a match outcome prediction.</w:t>
+        <w:t>python -m sporza_scraper predict --match Arsenal “Manchester City”</w:t>
       </w:r>
     </w:p>
     <w:p>
@@ -353,10 +536,10 @@
         <w:rPr>
           <w:b/>
         </w:rPr>
-        <w:t xml:space="preserve">Sentiment analysis: </w:t>
+        <w:t xml:space="preserve">Sentiment: </w:t>
       </w:r>
       <w:r>
-        <w:t>python -m sporza_scraper sentiment --top 10 — Shows the top-10 player sentiment rankings.</w:t>
+        <w:t>python -m sporza_scraper sentiment --top 10</w:t>
       </w:r>
     </w:p>
     <w:p>
@@ -367,7 +550,7 @@
         <w:t xml:space="preserve">Dashboard: </w:t>
       </w:r>
       <w:r>
-        <w:t>streamlit run sporza_scraper/dashboard.py — Launches the interactive web dashboard on port 8501.</w:t>
+        <w:t>streamlit run sporza_scraper/dashboard.py</w:t>
       </w:r>
     </w:p>
     <w:p>
@@ -378,7 +561,7 @@
         <w:t xml:space="preserve">Docker scrape: </w:t>
       </w:r>
       <w:r>
-        <w:t>docker compose run --rm scraper pl-scrape --limit 50 — Runs the scraper inside a container.</w:t>
+        <w:t>docker compose run --rm scraper pl-scrape --limit 50</w:t>
       </w:r>
     </w:p>
     <w:p>
@@ -389,7 +572,7 @@
         <w:t xml:space="preserve">Docker dashboard: </w:t>
       </w:r>
       <w:r>
-        <w:t>docker compose up dashboard — Starts the dashboard container on port 8501.</w:t>
+        <w:t>docker compose up dashboard</w:t>
       </w:r>
     </w:p>
     <w:sectPr>

</xml_diff>

<commit_message>
Fix dashboard: English translation, Path import fix, sys.path fix, updated reports
</commit_message>
<xml_diff>
--- a/Sporza_Scraper_Summary_Report.docx
+++ b/Sporza_Scraper_Summary_Report.docx
@@ -484,7 +484,113 @@
         <w:pStyle w:val="Heading1"/>
       </w:pPr>
       <w:r>
-        <w:t>6. Command Reference</w:t>
+        <w:t>6. Technologies and Dependencies</w:t>
+      </w:r>
+    </w:p>
+    <w:p>
+      <w:r>
+        <w:t>The project is built with Python 3.11+ and relies on the following key libraries: httpx for asynchronous HTTP requests with connection pooling, BeautifulSoup4 with lxml for fast HTML parsing, spaCy (nl_core_news_md) for Dutch named entity recognition, Streamlit for the interactive dashboard, pandas for data manipulation, SQLite3 (standard library) for database persistence, and tenacity for retry logic with exponential backoff. Development dependencies include pytest for the test suite.</w:t>
+      </w:r>
+    </w:p>
+    <w:p>
+      <w:r>
+        <w:t>The containerisation stack uses Docker with a multi-stage Python 3.11-slim base image and Docker Compose for service orchestration. The CI/CD workflow is supported by a comprehensive .dockerignore that keeps the build context lean, and health checks that allow container orchestrators to monitor service availability.</w:t>
+      </w:r>
+    </w:p>
+    <w:p>
+      <w:pPr>
+        <w:pStyle w:val="Heading1"/>
+      </w:pPr>
+      <w:r>
+        <w:t>7. Installation and Usage</w:t>
+      </w:r>
+    </w:p>
+    <w:p>
+      <w:r>
+        <w:rPr>
+          <w:b/>
+        </w:rPr>
+        <w:t xml:space="preserve">Prerequisites: </w:t>
+      </w:r>
+      <w:r>
+        <w:t>Python 3.11 or higher and pip. On macOS use python3/pip3 instead of python/pip.</w:t>
+      </w:r>
+    </w:p>
+    <w:p>
+      <w:r>
+        <w:rPr>
+          <w:b/>
+        </w:rPr>
+        <w:t xml:space="preserve">Step 1 — Install dependencies: </w:t>
+      </w:r>
+      <w:r>
+        <w:t>pip3 install -r requirements.txt</w:t>
+      </w:r>
+    </w:p>
+    <w:p>
+      <w:r>
+        <w:rPr>
+          <w:b/>
+        </w:rPr>
+        <w:t xml:space="preserve">Step 2 — Download spaCy model: </w:t>
+      </w:r>
+      <w:r>
+        <w:t>python3 -m spacy download nl_core_news_md</w:t>
+      </w:r>
+    </w:p>
+    <w:p>
+      <w:r>
+        <w:rPr>
+          <w:b/>
+        </w:rPr>
+        <w:t xml:space="preserve">Step 3 — Scrape PL articles: </w:t>
+      </w:r>
+      <w:r>
+        <w:t>python3 -m sporza_scraper pl-scrape --limit 50</w:t>
+      </w:r>
+    </w:p>
+    <w:p>
+      <w:r>
+        <w:rPr>
+          <w:b/>
+        </w:rPr>
+        <w:t xml:space="preserve">Step 4 — Download match stats: </w:t>
+      </w:r>
+      <w:r>
+        <w:t>python3 -m sporza_scraper stats --download</w:t>
+      </w:r>
+    </w:p>
+    <w:p>
+      <w:r>
+        <w:rPr>
+          <w:b/>
+        </w:rPr>
+        <w:t xml:space="preserve">Step 5 — Launch the dashboard: </w:t>
+      </w:r>
+      <w:r>
+        <w:t>streamlit run sporza_scraper/dashboard.py (opens on http://localhost:8501)</w:t>
+      </w:r>
+    </w:p>
+    <w:p>
+      <w:r>
+        <w:rPr>
+          <w:b/>
+        </w:rPr>
+        <w:t xml:space="preserve">Predict a match: </w:t>
+      </w:r>
+      <w:r>
+        <w:t>python3 -m sporza_scraper predict --match Arsenal “Manchester City”</w:t>
+      </w:r>
+    </w:p>
+    <w:p>
+      <w:r>
+        <w:rPr>
+          <w:b/>
+        </w:rPr>
+        <w:t xml:space="preserve">Sentiment rankings: </w:t>
+      </w:r>
+      <w:r>
+        <w:t>python3 -m sporza_scraper sentiment --top 10</w:t>
       </w:r>
     </w:p>
     <w:p>
@@ -495,7 +601,7 @@
         <w:t xml:space="preserve">News scrape: </w:t>
       </w:r>
       <w:r>
-        <w:t>python -m sporza_scraper news --limit 20</w:t>
+        <w:t>python3 -m sporza_scraper news --limit 20</w:t>
       </w:r>
     </w:p>
     <w:p>
@@ -503,76 +609,10 @@
         <w:rPr>
           <w:b/>
         </w:rPr>
-        <w:t xml:space="preserve">PL scrape: </w:t>
+        <w:t xml:space="preserve">Docker (alternative): </w:t>
       </w:r>
       <w:r>
-        <w:t>python -m sporza_scraper pl-scrape --limit 50</w:t>
-      </w:r>
-    </w:p>
-    <w:p>
-      <w:r>
-        <w:rPr>
-          <w:b/>
-        </w:rPr>
-        <w:t xml:space="preserve">Stats download: </w:t>
-      </w:r>
-      <w:r>
-        <w:t>python -m sporza_scraper stats --download</w:t>
-      </w:r>
-    </w:p>
-    <w:p>
-      <w:r>
-        <w:rPr>
-          <w:b/>
-        </w:rPr>
-        <w:t xml:space="preserve">Match prediction: </w:t>
-      </w:r>
-      <w:r>
-        <w:t>python -m sporza_scraper predict --match Arsenal “Manchester City”</w:t>
-      </w:r>
-    </w:p>
-    <w:p>
-      <w:r>
-        <w:rPr>
-          <w:b/>
-        </w:rPr>
-        <w:t xml:space="preserve">Sentiment: </w:t>
-      </w:r>
-      <w:r>
-        <w:t>python -m sporza_scraper sentiment --top 10</w:t>
-      </w:r>
-    </w:p>
-    <w:p>
-      <w:r>
-        <w:rPr>
-          <w:b/>
-        </w:rPr>
-        <w:t xml:space="preserve">Dashboard: </w:t>
-      </w:r>
-      <w:r>
-        <w:t>streamlit run sporza_scraper/dashboard.py</w:t>
-      </w:r>
-    </w:p>
-    <w:p>
-      <w:r>
-        <w:rPr>
-          <w:b/>
-        </w:rPr>
-        <w:t xml:space="preserve">Docker scrape: </w:t>
-      </w:r>
-      <w:r>
-        <w:t>docker compose run --rm scraper pl-scrape --limit 50</w:t>
-      </w:r>
-    </w:p>
-    <w:p>
-      <w:r>
-        <w:rPr>
-          <w:b/>
-        </w:rPr>
-        <w:t xml:space="preserve">Docker dashboard: </w:t>
-      </w:r>
-      <w:r>
-        <w:t>docker compose up dashboard</w:t>
+        <w:t>docker compose build, then docker compose run --rm scraper pl-scrape --limit 50 and docker compose up dashboard.</w:t>
       </w:r>
     </w:p>
     <w:sectPr>

</xml_diff>